<commit_message>
feat(baralho): cartas de abertura por dimensão + ordem oficial G-I-N-C-A
Adiciona data/baralho_ginga_dimensoes_intro.csv com 5 cartas (G00/I00/N00/
C00/A00) que apresentam cada dimensão, texto adaptado do referencial GINGA
(gingaglossario). Ficam fora do sorteio online (sql/002_seed_baralho.sql
continua gerado só a partir das 50 cartas de jogo) — servem para o baralho
impresso e para a leitura da equipe.

Reordena data/baralho_ginga_online.csv e src/lib/jogo/tipos.ts::DIMENSOES
para a ordem oficial: Governança, Incentivos, Normas, Gestão de
capacidades, Ambiência — mesma ordem em qualquer lugar que o baralho
aparece.

exportar_baralho_docx.py e importar_baralho_docx.py atualizados para o
novo bloco de abertura (round-trip validado: export -> import sem
alterações reproduz os dois CSVs originais byte a byte).

Co-Authored-By: Claude Sonnet 5 <noreply@anthropic.com>
</commit_message>
<xml_diff>
--- a/entregas/baralho_ginga_online.docx
+++ b/entregas/baralho_ginga_online.docx
@@ -30,7 +30,7 @@
         <w:pStyle w:val="ListBullet"/>
       </w:pPr>
       <w:r>
-        <w:t>• Não apague nem edite a coluna ID das cartas existentes (ex.: N01, I03).</w:t>
+        <w:t>• Não apague nem edite a coluna ID das cartas existentes (ex.: N01, I03, G00).</w:t>
       </w:r>
     </w:p>
     <w:p>
@@ -54,7 +54,302 @@
         <w:pStyle w:val="ListBullet"/>
       </w:pPr>
       <w:r>
+        <w:t>• A ordem das dimensões no baralho é sempre: Governança, Incentivos, Normas, Gestão de capacidades, Ambiência.</w:t>
+      </w:r>
+    </w:p>
+    <w:p>
+      <w:pPr>
+        <w:pStyle w:val="ListBullet"/>
+      </w:pPr>
+      <w:r>
         <w:t>• Não é preciso editar mais nenhum outro arquivo: ao devolver este .docx, o script de importação atualiza sozinho a versão impressa, a versão online e o banco de dados do jogo.</w:t>
+      </w:r>
+    </w:p>
+    <w:p>
+      <w:pPr>
+        <w:pStyle w:val="Heading1"/>
+      </w:pPr>
+      <w:r>
+        <w:t>Cartas de abertura — uma por dimensão</w:t>
+      </w:r>
+    </w:p>
+    <w:p>
+      <w:r>
+        <w:t>Estas 5 cartas abrem o baralho e apresentam cada dimensão antes de suas 10 cartas de jogo. Não fazem parte do sorteio da roda online.</w:t>
+      </w:r>
+    </w:p>
+    <w:tbl>
+      <w:tblPr>
+        <w:tblStyle w:val="LightGrid-Accent1"/>
+        <w:tblW w:type="auto" w:w="0"/>
+        <w:tblLook w:firstColumn="1" w:firstRow="1" w:lastColumn="0" w:lastRow="0" w:noHBand="0" w:noVBand="1" w:val="04A0"/>
+      </w:tblPr>
+      <w:tblGrid>
+        <w:gridCol w:w="2160"/>
+        <w:gridCol w:w="2160"/>
+        <w:gridCol w:w="2160"/>
+        <w:gridCol w:w="2160"/>
+      </w:tblGrid>
+      <w:tr>
+        <w:tc>
+          <w:tcPr>
+            <w:tcW w:type="dxa" w:w="2160"/>
+          </w:tcPr>
+          <w:p>
+            <w:r>
+              <w:t>ID</w:t>
+            </w:r>
+          </w:p>
+        </w:tc>
+        <w:tc>
+          <w:tcPr>
+            <w:tcW w:type="dxa" w:w="2160"/>
+          </w:tcPr>
+          <w:p>
+            <w:r>
+              <w:t>Dimensão</w:t>
+            </w:r>
+          </w:p>
+        </w:tc>
+        <w:tc>
+          <w:tcPr>
+            <w:tcW w:type="dxa" w:w="2160"/>
+          </w:tcPr>
+          <w:p>
+            <w:r>
+              <w:t>Carta</w:t>
+            </w:r>
+          </w:p>
+        </w:tc>
+        <w:tc>
+          <w:tcPr>
+            <w:tcW w:type="dxa" w:w="2160"/>
+          </w:tcPr>
+          <w:p>
+            <w:r>
+              <w:t>Explicação</w:t>
+            </w:r>
+          </w:p>
+        </w:tc>
+      </w:tr>
+      <w:tr>
+        <w:tc>
+          <w:tcPr>
+            <w:tcW w:type="dxa" w:w="2160"/>
+          </w:tcPr>
+          <w:p>
+            <w:r>
+              <w:t>G00</w:t>
+            </w:r>
+          </w:p>
+        </w:tc>
+        <w:tc>
+          <w:tcPr>
+            <w:tcW w:type="dxa" w:w="2160"/>
+          </w:tcPr>
+          <w:p>
+            <w:r>
+              <w:t>Governança</w:t>
+            </w:r>
+          </w:p>
+        </w:tc>
+        <w:tc>
+          <w:tcPr>
+            <w:tcW w:type="dxa" w:w="2160"/>
+          </w:tcPr>
+          <w:p>
+            <w:r>
+              <w:t>Governança</w:t>
+            </w:r>
+          </w:p>
+        </w:tc>
+        <w:tc>
+          <w:tcPr>
+            <w:tcW w:type="dxa" w:w="2160"/>
+          </w:tcPr>
+          <w:p>
+            <w:r>
+              <w:t>Coordenação estratégica, clareza de papéis e visão sistêmica: organiza o espaço de cooperação em que os agentes jogam juntos, esquivam com criatividade e leveza, lidando com riscos, controles e incertezas. Organiza e direciona a infraestrutura de inovação em governo.</w:t>
+            </w:r>
+          </w:p>
+        </w:tc>
+      </w:tr>
+      <w:tr>
+        <w:tc>
+          <w:tcPr>
+            <w:tcW w:type="dxa" w:w="2160"/>
+          </w:tcPr>
+          <w:p>
+            <w:r>
+              <w:t>I00</w:t>
+            </w:r>
+          </w:p>
+        </w:tc>
+        <w:tc>
+          <w:tcPr>
+            <w:tcW w:type="dxa" w:w="2160"/>
+          </w:tcPr>
+          <w:p>
+            <w:r>
+              <w:t>Incentivos</w:t>
+            </w:r>
+          </w:p>
+        </w:tc>
+        <w:tc>
+          <w:tcPr>
+            <w:tcW w:type="dxa" w:w="2160"/>
+          </w:tcPr>
+          <w:p>
+            <w:r>
+              <w:t>Incentivos</w:t>
+            </w:r>
+          </w:p>
+        </w:tc>
+        <w:tc>
+          <w:tcPr>
+            <w:tcW w:type="dxa" w:w="2160"/>
+          </w:tcPr>
+          <w:p>
+            <w:r>
+              <w:t>Recursos materiais, humanos, organizacionais, simbólicos e comportamentais que despertam a vontade e a coragem de inovar — a energia que mantém o jogo vivo, ativando a motivação para experimentar. Integra, usa e direciona as ferramentas e técnicas disponíveis para incentivar a inovação pública.</w:t>
+            </w:r>
+          </w:p>
+        </w:tc>
+      </w:tr>
+      <w:tr>
+        <w:tc>
+          <w:tcPr>
+            <w:tcW w:type="dxa" w:w="2160"/>
+          </w:tcPr>
+          <w:p>
+            <w:r>
+              <w:t>N00</w:t>
+            </w:r>
+          </w:p>
+        </w:tc>
+        <w:tc>
+          <w:tcPr>
+            <w:tcW w:type="dxa" w:w="2160"/>
+          </w:tcPr>
+          <w:p>
+            <w:r>
+              <w:t>Normas</w:t>
+            </w:r>
+          </w:p>
+        </w:tc>
+        <w:tc>
+          <w:tcPr>
+            <w:tcW w:type="dxa" w:w="2160"/>
+          </w:tcPr>
+          <w:p>
+            <w:r>
+              <w:t>Normas</w:t>
+            </w:r>
+          </w:p>
+        </w:tc>
+        <w:tc>
+          <w:tcPr>
+            <w:tcW w:type="dxa" w:w="2160"/>
+          </w:tcPr>
+          <w:p>
+            <w:r>
+              <w:t>Normas não engessam a inovação: aprimoram a gestão dos riscos inerentes à experimentação. Uma regulação adaptativa e ancorada no problema organiza, dá previsibilidade e protege a experimentação, evitando a armadilha da burocracia estéril. Institucionaliza a inovação na rotina dos órgãos públicos.</w:t>
+            </w:r>
+          </w:p>
+        </w:tc>
+      </w:tr>
+      <w:tr>
+        <w:tc>
+          <w:tcPr>
+            <w:tcW w:type="dxa" w:w="2160"/>
+          </w:tcPr>
+          <w:p>
+            <w:r>
+              <w:t>C00</w:t>
+            </w:r>
+          </w:p>
+        </w:tc>
+        <w:tc>
+          <w:tcPr>
+            <w:tcW w:type="dxa" w:w="2160"/>
+          </w:tcPr>
+          <w:p>
+            <w:r>
+              <w:t>Gestão de capacidades</w:t>
+            </w:r>
+          </w:p>
+        </w:tc>
+        <w:tc>
+          <w:tcPr>
+            <w:tcW w:type="dxa" w:w="2160"/>
+          </w:tcPr>
+          <w:p>
+            <w:r>
+              <w:t>Gestão de capacidades</w:t>
+            </w:r>
+          </w:p>
+        </w:tc>
+        <w:tc>
+          <w:tcPr>
+            <w:tcW w:type="dxa" w:w="2160"/>
+          </w:tcPr>
+          <w:p>
+            <w:r>
+              <w:t>Mensuração e desenvolvimento contínuo de competências e práticas institucionais para reorientar a política e aprender com a experiência — sem competição nem rankings, pautada em evidências para escolhas melhores, cooperação mais forte e decisões livres de vieses. Equilibra desigualdades e gerencia as capacidades organizacionais de inovação.</w:t>
+            </w:r>
+          </w:p>
+        </w:tc>
+      </w:tr>
+      <w:tr>
+        <w:tc>
+          <w:tcPr>
+            <w:tcW w:type="dxa" w:w="2160"/>
+          </w:tcPr>
+          <w:p>
+            <w:r>
+              <w:t>A00</w:t>
+            </w:r>
+          </w:p>
+        </w:tc>
+        <w:tc>
+          <w:tcPr>
+            <w:tcW w:type="dxa" w:w="2160"/>
+          </w:tcPr>
+          <w:p>
+            <w:r>
+              <w:t>Ambiência</w:t>
+            </w:r>
+          </w:p>
+        </w:tc>
+        <w:tc>
+          <w:tcPr>
+            <w:tcW w:type="dxa" w:w="2160"/>
+          </w:tcPr>
+          <w:p>
+            <w:r>
+              <w:t>Ambiência</w:t>
+            </w:r>
+          </w:p>
+        </w:tc>
+        <w:tc>
+          <w:tcPr>
+            <w:tcW w:type="dxa" w:w="2160"/>
+          </w:tcPr>
+          <w:p>
+            <w:r>
+              <w:t>Espaço institucional e humano onde a inovação é sustentada pela segurança psicológica: substitui modelos de comando e controle por ambientes livres de assédio e pautados em relações de confiança, abrindo espaço para o questionamento propositivo. Fomenta ambientes seguros, saudáveis e propulsores de inovação.</w:t>
+            </w:r>
+          </w:p>
+        </w:tc>
+      </w:tr>
+    </w:tbl>
+    <w:p/>
+    <w:p>
+      <w:pPr>
+        <w:pStyle w:val="Heading1"/>
+      </w:pPr>
+      <w:r>
+        <w:t>Cartas do baralho — 10 por dimensão</w:t>
       </w:r>
     </w:p>
     <w:p>
@@ -63,9 +358,9 @@
       </w:pPr>
       <w:r>
         <w:rPr>
-          <w:color w:val="0E3E66"/>
+          <w:color w:val="CC76A7"/>
         </w:rPr>
-        <w:t>Normas</w:t>
+        <w:t>Governança</w:t>
       </w:r>
     </w:p>
     <w:tbl>
@@ -129,7 +424,7 @@
           </w:tcPr>
           <w:p>
             <w:r>
-              <w:t>N01</w:t>
+              <w:t>G01</w:t>
             </w:r>
           </w:p>
         </w:tc>
@@ -139,7 +434,7 @@
           </w:tcPr>
           <w:p>
             <w:r>
-              <w:t>Gambiarra</w:t>
+              <w:t>Quem puxa a roda</w:t>
             </w:r>
           </w:p>
         </w:tc>
@@ -149,7 +444,7 @@
           </w:tcPr>
           <w:p>
             <w:r>
-              <w:t>A solução engenhosa que funciona antes de virar regra ou processo formal.</w:t>
+              <w:t>A liderança que articula mobiliza e mantém o ritmo colaborativo da equipe.</w:t>
             </w:r>
           </w:p>
         </w:tc>
@@ -159,7 +454,7 @@
           </w:tcPr>
           <w:p>
             <w:r>
-              <w:t>Conte uma gambiarra sua que merecia virar norma. Ou uma que deu errado e mostrou onde a regra fazia falta.</w:t>
+              <w:t>Conte um trabalho em parceria no qual faltou alguém para coordenar e manter o ritmo. Qual foi o desfecho?</w:t>
             </w:r>
           </w:p>
         </w:tc>
@@ -171,7 +466,7 @@
           </w:tcPr>
           <w:p>
             <w:r>
-              <w:t>N02</w:t>
+              <w:t>G02</w:t>
             </w:r>
           </w:p>
         </w:tc>
@@ -181,7 +476,7 @@
           </w:tcPr>
           <w:p>
             <w:r>
-              <w:t>Carimbo</w:t>
+              <w:t>Papel de cada um</w:t>
             </w:r>
           </w:p>
         </w:tc>
@@ -191,7 +486,7 @@
           </w:tcPr>
           <w:p>
             <w:r>
-              <w:t>A exigência formal que pode proteger a decisão ou apenas burocratizar o processo.</w:t>
+              <w:t>A clareza de atribuições que faz o trabalho coletivo fluir sem sobreposições.</w:t>
             </w:r>
           </w:p>
         </w:tc>
@@ -201,7 +496,7 @@
           </w:tcPr>
           <w:p>
             <w:r>
-              <w:t>Conte uma vez em que uma etapa burocrática salvou seu trabalho — ou uma em que o carimbo só serviu para atrapalhar.</w:t>
+              <w:t>Conte uma vez em que a indefinição de papéis travou uma entrega relevante — ou em que a clareza destravou o processo.</w:t>
             </w:r>
           </w:p>
         </w:tc>
@@ -213,7 +508,7 @@
           </w:tcPr>
           <w:p>
             <w:r>
-              <w:t>N03</w:t>
+              <w:t>G03</w:t>
             </w:r>
           </w:p>
         </w:tc>
@@ -223,7 +518,7 @@
           </w:tcPr>
           <w:p>
             <w:r>
-              <w:t>Piloto</w:t>
+              <w:t>Manda quem pode, obedece quem tem juízo?</w:t>
             </w:r>
           </w:p>
         </w:tc>
@@ -233,7 +528,7 @@
           </w:tcPr>
           <w:p>
             <w:r>
-              <w:t>Testar pequeno antes de fazer grande: o erro barato que evita o erro caro.</w:t>
+              <w:t>Governança colaborativa: coordenar orientando o jogo sem autoritarismo.</w:t>
             </w:r>
           </w:p>
         </w:tc>
@@ -243,7 +538,7 @@
           </w:tcPr>
           <w:p>
             <w:r>
-              <w:t>Conte um teste que você realizou em escala pequena. Ele cresceu, foi descontinuado ou ficou no meio do caminho?</w:t>
+              <w:t>Conte um projeto que prosperou sob liderança facilitadora — ou um que desandou pelo excesso de comando e controle.</w:t>
             </w:r>
           </w:p>
         </w:tc>
@@ -255,7 +550,7 @@
           </w:tcPr>
           <w:p>
             <w:r>
-              <w:t>N04</w:t>
+              <w:t>G04</w:t>
             </w:r>
           </w:p>
         </w:tc>
@@ -265,7 +560,7 @@
           </w:tcPr>
           <w:p>
             <w:r>
-              <w:t>Tropeço</w:t>
+              <w:t>Quando o chefe muda</w:t>
             </w:r>
           </w:p>
         </w:tc>
@@ -275,7 +570,7 @@
           </w:tcPr>
           <w:p>
             <w:r>
-              <w:t>Quem ginga tropeça: o erro como etapa natural e pedagógica da inovação.</w:t>
+              <w:t>A capacidade de transformar iniciativas em políticas institucionais perenes.</w:t>
             </w:r>
           </w:p>
         </w:tc>
@@ -285,7 +580,7 @@
           </w:tcPr>
           <w:p>
             <w:r>
-              <w:t>Conte um tropeço seu tentando fazer diferente. O que ele ensinou, e como o aprendizado foi compartilhado?</w:t>
+              <w:t>Conte um projeto que sobreviveu (ou foi descontinuado) em uma troca de gestão. O que fez a diferença para a continuidade?</w:t>
             </w:r>
           </w:p>
         </w:tc>
@@ -297,7 +592,7 @@
           </w:tcPr>
           <w:p>
             <w:r>
-              <w:t>N05</w:t>
+              <w:t>G05</w:t>
             </w:r>
           </w:p>
         </w:tc>
@@ -307,7 +602,7 @@
           </w:tcPr>
           <w:p>
             <w:r>
-              <w:t>Brecha</w:t>
+              <w:t>Reinventar a roda</w:t>
             </w:r>
           </w:p>
         </w:tc>
@@ -317,7 +612,7 @@
           </w:tcPr>
           <w:p>
             <w:r>
-              <w:t>O espaço legítimo dentro da regra para fazer o certo de um jeito novo.</w:t>
+              <w:t>A falta de integração que faz equipes recriarem o que outros já resolveram.</w:t>
             </w:r>
           </w:p>
         </w:tc>
@@ -327,7 +622,7 @@
           </w:tcPr>
           <w:p>
             <w:r>
-              <w:t>Conte uma vez em que você encontrou na norma uma brecha para inovar. Ou procurou, não encontrou, e o que fez então.</w:t>
+              <w:t>Conte quando você descobriu que outro órgão já havia desenvolvido uma solução similar à que você estava criando.</w:t>
             </w:r>
           </w:p>
         </w:tc>
@@ -339,7 +634,7 @@
           </w:tcPr>
           <w:p>
             <w:r>
-              <w:t>N06</w:t>
+              <w:t>G06</w:t>
             </w:r>
           </w:p>
         </w:tc>
@@ -349,7 +644,7 @@
           </w:tcPr>
           <w:p>
             <w:r>
-              <w:t>Letra miúda</w:t>
+              <w:t>Fio da meada</w:t>
             </w:r>
           </w:p>
         </w:tc>
@@ -359,7 +654,7 @@
           </w:tcPr>
           <w:p>
             <w:r>
-              <w:t>O detalhe normativo que ninguém lê, mas que define a viabilidade da ideia.</w:t>
+              <w:t>A gestão do conhecimento que documenta o processo e evita o recomeço do zero.</w:t>
             </w:r>
           </w:p>
         </w:tc>
@@ -369,7 +664,7 @@
           </w:tcPr>
           <w:p>
             <w:r>
-              <w:t>Conte a vez em que a letra miúda te surpreendeu, ou em que conhecê-la a fundo salvou o projeto.</w:t>
+              <w:t>Conte quando a ausência de memória institucional fez o trabalho recomeçar do zero — ou quando uma boa documentação salvou tempo.</w:t>
             </w:r>
           </w:p>
         </w:tc>
@@ -381,7 +676,7 @@
           </w:tcPr>
           <w:p>
             <w:r>
-              <w:t>N07</w:t>
+              <w:t>G07</w:t>
             </w:r>
           </w:p>
         </w:tc>
@@ -391,7 +686,7 @@
           </w:tcPr>
           <w:p>
             <w:r>
-              <w:t>Virou rotina</w:t>
+              <w:t>Destrava</w:t>
             </w:r>
           </w:p>
         </w:tc>
@@ -401,7 +696,7 @@
           </w:tcPr>
           <w:p>
             <w:r>
-              <w:t>A inovação que começou como teste e transformou a prática do dia a dia.</w:t>
+              <w:t>Identificar os gargalos e acionar os atores certos para destravar o fluxo.</w:t>
             </w:r>
           </w:p>
         </w:tc>
@@ -411,7 +706,7 @@
           </w:tcPr>
           <w:p>
             <w:r>
-              <w:t>Conte algo que nasceu como experiência piloto e hoje é rotina no seu órgão. O que fez a ideia se consolidar?</w:t>
+              <w:t>Conte um trabalho seu que emperrou na burocracia. Quem ajudou a destravar ou o que faltou para a decisão avançar?</w:t>
             </w:r>
           </w:p>
         </w:tc>
@@ -423,7 +718,7 @@
           </w:tcPr>
           <w:p>
             <w:r>
-              <w:t>N08</w:t>
+              <w:t>G08</w:t>
             </w:r>
           </w:p>
         </w:tc>
@@ -433,7 +728,7 @@
           </w:tcPr>
           <w:p>
             <w:r>
-              <w:t>Engavetado</w:t>
+              <w:t>Mãos dadas</w:t>
             </w:r>
           </w:p>
         </w:tc>
@@ -443,7 +738,7 @@
           </w:tcPr>
           <w:p>
             <w:r>
-              <w:t>O projeto que parou na gaveta à espera de assinatura conjuntura ou parceiro.</w:t>
+              <w:t>O que extrapola sua competência direta se constrói por diálogo e pactuação.</w:t>
             </w:r>
           </w:p>
         </w:tc>
@@ -453,7 +748,7 @@
           </w:tcPr>
           <w:p>
             <w:r>
-              <w:t>Conte um projeto importante seu que foi engavetado. Ele saiu de lá? O que faltou e o que você faria diferente?</w:t>
+              <w:t>Conte uma parceria entre órgãos ou equipes que prosperou por pactuação conjunta — ou uma que falhou por imposição de cima.</w:t>
             </w:r>
           </w:p>
         </w:tc>
@@ -465,7 +760,7 @@
           </w:tcPr>
           <w:p>
             <w:r>
-              <w:t>N09</w:t>
+              <w:t>G09</w:t>
             </w:r>
           </w:p>
         </w:tc>
@@ -475,7 +770,7 @@
           </w:tcPr>
           <w:p>
             <w:r>
-              <w:t>Combinado</w:t>
+              <w:t>O cidadão no centro da roda</w:t>
             </w:r>
           </w:p>
         </w:tc>
@@ -485,7 +780,7 @@
           </w:tcPr>
           <w:p>
             <w:r>
-              <w:t>O alinhamento compartilhado que pactua expectativas e evita retrabalho.</w:t>
+              <w:t>Governança pública legítima orientada pelo impacto real na vida do cidadão.</w:t>
             </w:r>
           </w:p>
         </w:tc>
@@ -495,7 +790,7 @@
           </w:tcPr>
           <w:p>
             <w:r>
-              <w:t>Conte um combinado formal ou informal que evitou um problema grave — ou a confusão que veio por faltar alinhamento prévio.</w:t>
+              <w:t>Conte uma decisão que mudou positivamente quando alguém perguntou como isso afeta o cidadão? — ou quando faltou essa pergunta.</w:t>
             </w:r>
           </w:p>
         </w:tc>
@@ -507,7 +802,7 @@
           </w:tcPr>
           <w:p>
             <w:r>
-              <w:t>N10</w:t>
+              <w:t>G10</w:t>
             </w:r>
           </w:p>
         </w:tc>
@@ -517,7 +812,7 @@
           </w:tcPr>
           <w:p>
             <w:r>
-              <w:t>Papel passado</w:t>
+              <w:t>Olho no lance</w:t>
             </w:r>
           </w:p>
         </w:tc>
@@ -527,7 +822,7 @@
           </w:tcPr>
           <w:p>
             <w:r>
-              <w:t>Registrar formalmente para dar segurança jurídica e continuidade ao projeto.</w:t>
+              <w:t>O acompanhamento estratégico que facilita entregas sem sufocar a autonomia.</w:t>
             </w:r>
           </w:p>
         </w:tc>
@@ -537,7 +832,7 @@
           </w:tcPr>
           <w:p>
             <w:r>
-              <w:t>Conte uma vez em que registrar ou normatizar algo (ou deixar de registrar) mudou decisivamente o rumo da história.</w:t>
+              <w:t>Conte uma experiência de gestão que deu apoio e simplificou seu trabalho — ou uma que só gerou relatórios sem utilidade prática.</w:t>
             </w:r>
           </w:p>
         </w:tc>
@@ -1037,9 +1332,9 @@
       </w:pPr>
       <w:r>
         <w:rPr>
-          <w:color w:val="D14B2A"/>
+          <w:color w:val="0E3E66"/>
         </w:rPr>
-        <w:t>Ambiência</w:t>
+        <w:t>Normas</w:t>
       </w:r>
     </w:p>
     <w:tbl>
@@ -1103,7 +1398,7 @@
           </w:tcPr>
           <w:p>
             <w:r>
-              <w:t>A01</w:t>
+              <w:t>N01</w:t>
             </w:r>
           </w:p>
         </w:tc>
@@ -1113,7 +1408,7 @@
           </w:tcPr>
           <w:p>
             <w:r>
-              <w:t>Pisar em ovos</w:t>
+              <w:t>Gambiarra</w:t>
             </w:r>
           </w:p>
         </w:tc>
@@ -1123,7 +1418,7 @@
           </w:tcPr>
           <w:p>
             <w:r>
-              <w:t>O clima de desconfiança em que o medo do erro paralisa a iniciativa.</w:t>
+              <w:t>A solução engenhosa que funciona antes de virar regra ou processo formal.</w:t>
             </w:r>
           </w:p>
         </w:tc>
@@ -1133,7 +1428,7 @@
           </w:tcPr>
           <w:p>
             <w:r>
-              <w:t>Conte um ambiente de trabalho onde você pisava em ovos. O que causava isso? E um onde você podia ser autêntico(a)?</w:t>
+              <w:t>Conte uma gambiarra sua que merecia virar norma. Ou uma que deu errado e mostrou onde a regra fazia falta.</w:t>
             </w:r>
           </w:p>
         </w:tc>
@@ -1145,7 +1440,7 @@
           </w:tcPr>
           <w:p>
             <w:r>
-              <w:t>A02</w:t>
+              <w:t>N02</w:t>
             </w:r>
           </w:p>
         </w:tc>
@@ -1155,7 +1450,7 @@
           </w:tcPr>
           <w:p>
             <w:r>
-              <w:t>Elefante na sala</w:t>
+              <w:t>Carimbo</w:t>
             </w:r>
           </w:p>
         </w:tc>
@@ -1165,7 +1460,7 @@
           </w:tcPr>
           <w:p>
             <w:r>
-              <w:t>O problema evidente que todos enxergam mas ninguém tem coragem de nomear.</w:t>
+              <w:t>A exigência formal que pode proteger a decisão ou apenas burocratizar o processo.</w:t>
             </w:r>
           </w:p>
         </w:tc>
@@ -1175,7 +1470,7 @@
           </w:tcPr>
           <w:p>
             <w:r>
-              <w:t>Conte uma vez em que alguém nomeou com coragem o elefante na sala. O que mudou depois? E quando ninguém falou qual foi o custo?</w:t>
+              <w:t>Conte uma vez em que uma etapa burocrática salvou seu trabalho — ou uma em que o carimbo só serviu para atrapalhar.</w:t>
             </w:r>
           </w:p>
         </w:tc>
@@ -1187,7 +1482,7 @@
           </w:tcPr>
           <w:p>
             <w:r>
-              <w:t>A03</w:t>
+              <w:t>N03</w:t>
             </w:r>
           </w:p>
         </w:tc>
@@ -1197,7 +1492,7 @@
           </w:tcPr>
           <w:p>
             <w:r>
-              <w:t>Guardei pra mim</w:t>
+              <w:t>Piloto</w:t>
             </w:r>
           </w:p>
         </w:tc>
@@ -1207,7 +1502,7 @@
           </w:tcPr>
           <w:p>
             <w:r>
-              <w:t>A ideia ou o alerta que ficou retido porque falar custava caro demais.</w:t>
+              <w:t>Testar pequeno antes de fazer grande: o erro barato que evita o erro caro.</w:t>
             </w:r>
           </w:p>
         </w:tc>
@@ -1217,7 +1512,7 @@
           </w:tcPr>
           <w:p>
             <w:r>
-              <w:t>Conte uma ideia ou preocupação que você guardou para si por receio da reação. O que teria mudado se houvesse abertura?</w:t>
+              <w:t>Conte um teste que você realizou em escala pequena. Ele cresceu, foi descontinuado ou ficou no meio do caminho?</w:t>
             </w:r>
           </w:p>
         </w:tc>
@@ -1229,7 +1524,7 @@
           </w:tcPr>
           <w:p>
             <w:r>
-              <w:t>A04</w:t>
+              <w:t>N04</w:t>
             </w:r>
           </w:p>
         </w:tc>
@@ -1239,7 +1534,7 @@
           </w:tcPr>
           <w:p>
             <w:r>
-              <w:t>Portas abertas</w:t>
+              <w:t>Tropeço</w:t>
             </w:r>
           </w:p>
         </w:tc>
@@ -1249,7 +1544,7 @@
           </w:tcPr>
           <w:p>
             <w:r>
-              <w:t>A liderança acessível e empática que acolhe a inovação com apoio efetivo.</w:t>
+              <w:t>Quem ginga tropeça: o erro como etapa natural e pedagógica da inovação.</w:t>
             </w:r>
           </w:p>
         </w:tc>
@@ -1259,7 +1554,7 @@
           </w:tcPr>
           <w:p>
             <w:r>
-              <w:t>Conte como a presença de uma chefia de portas verdadeiramente abertas (ou fechadas) impactou a segurança da equipe.</w:t>
+              <w:t>Conte um tropeço seu tentando fazer diferente. O que ele ensinou, e como o aprendizado foi compartilhado?</w:t>
             </w:r>
           </w:p>
         </w:tc>
@@ -1271,7 +1566,7 @@
           </w:tcPr>
           <w:p>
             <w:r>
-              <w:t>A05</w:t>
+              <w:t>N05</w:t>
             </w:r>
           </w:p>
         </w:tc>
@@ -1281,7 +1576,7 @@
           </w:tcPr>
           <w:p>
             <w:r>
-              <w:t>Não sei</w:t>
+              <w:t>Brecha</w:t>
             </w:r>
           </w:p>
         </w:tc>
@@ -1291,7 +1586,7 @@
           </w:tcPr>
           <w:p>
             <w:r>
-              <w:t>A segurança psicológica de admitir limites como ponto de partida para aprender.</w:t>
+              <w:t>O espaço legítimo dentro da regra para fazer o certo de um jeito novo.</w:t>
             </w:r>
           </w:p>
         </w:tc>
@@ -1301,7 +1596,7 @@
           </w:tcPr>
           <w:p>
             <w:r>
-              <w:t>Conte quando um não sei ou me desculpe dito em público abriu espaço para cooperação — ou quando o orgulho custou caro.</w:t>
+              <w:t>Conte uma vez em que você encontrou na norma uma brecha para inovar. Ou procurou, não encontrou, e o que fez então.</w:t>
             </w:r>
           </w:p>
         </w:tc>
@@ -1313,7 +1608,7 @@
           </w:tcPr>
           <w:p>
             <w:r>
-              <w:t>A06</w:t>
+              <w:t>N06</w:t>
             </w:r>
           </w:p>
         </w:tc>
@@ -1323,7 +1618,7 @@
           </w:tcPr>
           <w:p>
             <w:r>
-              <w:t>Dar um toque</w:t>
+              <w:t>Letra miúda</w:t>
             </w:r>
           </w:p>
         </w:tc>
@@ -1333,7 +1628,7 @@
           </w:tcPr>
           <w:p>
             <w:r>
-              <w:t>O feedback construtivo e transparente que ajusta a rota com respeito e cuidado.</w:t>
+              <w:t>O detalhe normativo que ninguém lê, mas que define a viabilidade da ideia.</w:t>
             </w:r>
           </w:p>
         </w:tc>
@@ -1343,7 +1638,7 @@
           </w:tcPr>
           <w:p>
             <w:r>
-              <w:t>Conte um feedback sincero que você recebeu e aprimorou seu trabalho — ou aquele retorno que faltou e fez falta.</w:t>
+              <w:t>Conte a vez em que a letra miúda te surpreendeu, ou em que conhecê-la a fundo salvou o projeto.</w:t>
             </w:r>
           </w:p>
         </w:tc>
@@ -1355,7 +1650,7 @@
           </w:tcPr>
           <w:p>
             <w:r>
-              <w:t>A07</w:t>
+              <w:t>N07</w:t>
             </w:r>
           </w:p>
         </w:tc>
@@ -1365,7 +1660,7 @@
           </w:tcPr>
           <w:p>
             <w:r>
-              <w:t>Fazer o que fala</w:t>
+              <w:t>Virou rotina</w:t>
             </w:r>
           </w:p>
         </w:tc>
@@ -1375,7 +1670,7 @@
           </w:tcPr>
           <w:p>
             <w:r>
-              <w:t>A coerência entre o discurso institucional e as atitudes práticas da gestão.</w:t>
+              <w:t>A inovação que começou como teste e transformou a prática do dia a dia.</w:t>
             </w:r>
           </w:p>
         </w:tc>
@@ -1385,7 +1680,7 @@
           </w:tcPr>
           <w:p>
             <w:r>
-              <w:t>Conte uma atitude coerente da liderança que gerou forte confiança na equipe — ou uma quebra de discurso que desmobilizou o time.</w:t>
+              <w:t>Conte algo que nasceu como experiência piloto e hoje é rotina no seu órgão. O que fez a ideia se consolidar?</w:t>
             </w:r>
           </w:p>
         </w:tc>
@@ -1397,7 +1692,7 @@
           </w:tcPr>
           <w:p>
             <w:r>
-              <w:t>A08</w:t>
+              <w:t>N08</w:t>
             </w:r>
           </w:p>
         </w:tc>
@@ -1407,7 +1702,7 @@
           </w:tcPr>
           <w:p>
             <w:r>
-              <w:t>Prego que se destaca</w:t>
+              <w:t>Engavetado</w:t>
             </w:r>
           </w:p>
         </w:tc>
@@ -1417,7 +1712,7 @@
           </w:tcPr>
           <w:p>
             <w:r>
-              <w:t>Na cultura de inovação quem se destaca recebe apoio e abre caminhos.</w:t>
+              <w:t>O projeto que parou na gaveta à espera de assinatura conjuntura ou parceiro.</w:t>
             </w:r>
           </w:p>
         </w:tc>
@@ -1427,7 +1722,7 @@
           </w:tcPr>
           <w:p>
             <w:r>
-              <w:t>Conte quando propor algo novo te rendeu apoio e oportunidades — ou quando gerou resistência e o que isso ensinou.</w:t>
+              <w:t>Conte um projeto importante seu que foi engavetado. Ele saiu de lá? O que faltou e o que você faria diferente?</w:t>
             </w:r>
           </w:p>
         </w:tc>
@@ -1439,7 +1734,7 @@
           </w:tcPr>
           <w:p>
             <w:r>
-              <w:t>A09</w:t>
+              <w:t>N09</w:t>
             </w:r>
           </w:p>
         </w:tc>
@@ -1449,7 +1744,7 @@
           </w:tcPr>
           <w:p>
             <w:r>
-              <w:t>Pertencimento</w:t>
+              <w:t>Combinado</w:t>
             </w:r>
           </w:p>
         </w:tc>
@@ -1459,7 +1754,7 @@
           </w:tcPr>
           <w:p>
             <w:r>
-              <w:t>Sentir-se parte integrante e corresponsável por uma missão pública maior.</w:t>
+              <w:t>O alinhamento compartilhado que pactua expectativas e evita retrabalho.</w:t>
             </w:r>
           </w:p>
         </w:tc>
@@ -1469,7 +1764,7 @@
           </w:tcPr>
           <w:p>
             <w:r>
-              <w:t>Conte quando você se sentiu verdadeiramente acolhido(a) e parte do propósito do órgão. O que gerou esse sentimento?</w:t>
+              <w:t>Conte um combinado formal ou informal que evitou um problema grave — ou a confusão que veio por faltar alinhamento prévio.</w:t>
             </w:r>
           </w:p>
         </w:tc>
@@ -1481,7 +1776,7 @@
           </w:tcPr>
           <w:p>
             <w:r>
-              <w:t>A10</w:t>
+              <w:t>N10</w:t>
             </w:r>
           </w:p>
         </w:tc>
@@ -1491,7 +1786,7 @@
           </w:tcPr>
           <w:p>
             <w:r>
-              <w:t>Respiro</w:t>
+              <w:t>Papel passado</w:t>
             </w:r>
           </w:p>
         </w:tc>
@@ -1501,7 +1796,7 @@
           </w:tcPr>
           <w:p>
             <w:r>
-              <w:t>O tempo protegido na rotina para pensar se inspirar e inovar com clareza.</w:t>
+              <w:t>Registrar formalmente para dar segurança jurídica e continuidade ao projeto.</w:t>
             </w:r>
           </w:p>
         </w:tc>
@@ -1511,494 +1806,7 @@
           </w:tcPr>
           <w:p>
             <w:r>
-              <w:t>Conte quando uma pausa estratégica na rotina rendeu uma excelente solução — ou o que você criaria com um tempo livre semanal.</w:t>
-            </w:r>
-          </w:p>
-        </w:tc>
-      </w:tr>
-    </w:tbl>
-    <w:p/>
-    <w:p>
-      <w:pPr>
-        <w:pStyle w:val="Heading2"/>
-      </w:pPr>
-      <w:r>
-        <w:rPr>
-          <w:color w:val="CC76A7"/>
-        </w:rPr>
-        <w:t>Governança</w:t>
-      </w:r>
-    </w:p>
-    <w:tbl>
-      <w:tblPr>
-        <w:tblStyle w:val="LightGrid-Accent1"/>
-        <w:tblW w:type="auto" w:w="0"/>
-        <w:tblLook w:firstColumn="1" w:firstRow="1" w:lastColumn="0" w:lastRow="0" w:noHBand="0" w:noVBand="1" w:val="04A0"/>
-      </w:tblPr>
-      <w:tblGrid>
-        <w:gridCol w:w="2160"/>
-        <w:gridCol w:w="2160"/>
-        <w:gridCol w:w="2160"/>
-        <w:gridCol w:w="2160"/>
-      </w:tblGrid>
-      <w:tr>
-        <w:tc>
-          <w:tcPr>
-            <w:tcW w:type="dxa" w:w="2160"/>
-          </w:tcPr>
-          <w:p>
-            <w:r>
-              <w:t>ID</w:t>
-            </w:r>
-          </w:p>
-        </w:tc>
-        <w:tc>
-          <w:tcPr>
-            <w:tcW w:type="dxa" w:w="2160"/>
-          </w:tcPr>
-          <w:p>
-            <w:r>
-              <w:t>Carta</w:t>
-            </w:r>
-          </w:p>
-        </w:tc>
-        <w:tc>
-          <w:tcPr>
-            <w:tcW w:type="dxa" w:w="2160"/>
-          </w:tcPr>
-          <w:p>
-            <w:r>
-              <w:t>Definição</w:t>
-            </w:r>
-          </w:p>
-        </w:tc>
-        <w:tc>
-          <w:tcPr>
-            <w:tcW w:type="dxa" w:w="2160"/>
-          </w:tcPr>
-          <w:p>
-            <w:r>
-              <w:t>Pergunta</w:t>
-            </w:r>
-          </w:p>
-        </w:tc>
-      </w:tr>
-      <w:tr>
-        <w:tc>
-          <w:tcPr>
-            <w:tcW w:type="dxa" w:w="2160"/>
-          </w:tcPr>
-          <w:p>
-            <w:r>
-              <w:t>G01</w:t>
-            </w:r>
-          </w:p>
-        </w:tc>
-        <w:tc>
-          <w:tcPr>
-            <w:tcW w:type="dxa" w:w="2160"/>
-          </w:tcPr>
-          <w:p>
-            <w:r>
-              <w:t>Quem puxa a roda</w:t>
-            </w:r>
-          </w:p>
-        </w:tc>
-        <w:tc>
-          <w:tcPr>
-            <w:tcW w:type="dxa" w:w="2160"/>
-          </w:tcPr>
-          <w:p>
-            <w:r>
-              <w:t>A liderança que articula mobiliza e mantém o ritmo colaborativo da equipe.</w:t>
-            </w:r>
-          </w:p>
-        </w:tc>
-        <w:tc>
-          <w:tcPr>
-            <w:tcW w:type="dxa" w:w="2160"/>
-          </w:tcPr>
-          <w:p>
-            <w:r>
-              <w:t>Conte um trabalho em parceria no qual faltou alguém para coordenar e manter o ritmo. Qual foi o desfecho?</w:t>
-            </w:r>
-          </w:p>
-        </w:tc>
-      </w:tr>
-      <w:tr>
-        <w:tc>
-          <w:tcPr>
-            <w:tcW w:type="dxa" w:w="2160"/>
-          </w:tcPr>
-          <w:p>
-            <w:r>
-              <w:t>G02</w:t>
-            </w:r>
-          </w:p>
-        </w:tc>
-        <w:tc>
-          <w:tcPr>
-            <w:tcW w:type="dxa" w:w="2160"/>
-          </w:tcPr>
-          <w:p>
-            <w:r>
-              <w:t>Papel de cada um</w:t>
-            </w:r>
-          </w:p>
-        </w:tc>
-        <w:tc>
-          <w:tcPr>
-            <w:tcW w:type="dxa" w:w="2160"/>
-          </w:tcPr>
-          <w:p>
-            <w:r>
-              <w:t>A clareza de atribuições que faz o trabalho coletivo fluir sem sobreposições.</w:t>
-            </w:r>
-          </w:p>
-        </w:tc>
-        <w:tc>
-          <w:tcPr>
-            <w:tcW w:type="dxa" w:w="2160"/>
-          </w:tcPr>
-          <w:p>
-            <w:r>
-              <w:t>Conte uma vez em que a indefinição de papéis travou uma entrega relevante — ou em que a clareza destravou o processo.</w:t>
-            </w:r>
-          </w:p>
-        </w:tc>
-      </w:tr>
-      <w:tr>
-        <w:tc>
-          <w:tcPr>
-            <w:tcW w:type="dxa" w:w="2160"/>
-          </w:tcPr>
-          <w:p>
-            <w:r>
-              <w:t>G03</w:t>
-            </w:r>
-          </w:p>
-        </w:tc>
-        <w:tc>
-          <w:tcPr>
-            <w:tcW w:type="dxa" w:w="2160"/>
-          </w:tcPr>
-          <w:p>
-            <w:r>
-              <w:t>Manda quem pode, obedece quem tem juízo?</w:t>
-            </w:r>
-          </w:p>
-        </w:tc>
-        <w:tc>
-          <w:tcPr>
-            <w:tcW w:type="dxa" w:w="2160"/>
-          </w:tcPr>
-          <w:p>
-            <w:r>
-              <w:t>Governança colaborativa: coordenar orientando o jogo sem autoritarismo.</w:t>
-            </w:r>
-          </w:p>
-        </w:tc>
-        <w:tc>
-          <w:tcPr>
-            <w:tcW w:type="dxa" w:w="2160"/>
-          </w:tcPr>
-          <w:p>
-            <w:r>
-              <w:t>Conte um projeto que prosperou sob liderança facilitadora — ou um que desandou pelo excesso de comando e controle.</w:t>
-            </w:r>
-          </w:p>
-        </w:tc>
-      </w:tr>
-      <w:tr>
-        <w:tc>
-          <w:tcPr>
-            <w:tcW w:type="dxa" w:w="2160"/>
-          </w:tcPr>
-          <w:p>
-            <w:r>
-              <w:t>G04</w:t>
-            </w:r>
-          </w:p>
-        </w:tc>
-        <w:tc>
-          <w:tcPr>
-            <w:tcW w:type="dxa" w:w="2160"/>
-          </w:tcPr>
-          <w:p>
-            <w:r>
-              <w:t>Quando o chefe muda</w:t>
-            </w:r>
-          </w:p>
-        </w:tc>
-        <w:tc>
-          <w:tcPr>
-            <w:tcW w:type="dxa" w:w="2160"/>
-          </w:tcPr>
-          <w:p>
-            <w:r>
-              <w:t>A capacidade de transformar iniciativas em políticas institucionais perenes.</w:t>
-            </w:r>
-          </w:p>
-        </w:tc>
-        <w:tc>
-          <w:tcPr>
-            <w:tcW w:type="dxa" w:w="2160"/>
-          </w:tcPr>
-          <w:p>
-            <w:r>
-              <w:t>Conte um projeto que sobreviveu (ou foi descontinuado) em uma troca de gestão. O que fez a diferença para a continuidade?</w:t>
-            </w:r>
-          </w:p>
-        </w:tc>
-      </w:tr>
-      <w:tr>
-        <w:tc>
-          <w:tcPr>
-            <w:tcW w:type="dxa" w:w="2160"/>
-          </w:tcPr>
-          <w:p>
-            <w:r>
-              <w:t>G05</w:t>
-            </w:r>
-          </w:p>
-        </w:tc>
-        <w:tc>
-          <w:tcPr>
-            <w:tcW w:type="dxa" w:w="2160"/>
-          </w:tcPr>
-          <w:p>
-            <w:r>
-              <w:t>Reinventar a roda</w:t>
-            </w:r>
-          </w:p>
-        </w:tc>
-        <w:tc>
-          <w:tcPr>
-            <w:tcW w:type="dxa" w:w="2160"/>
-          </w:tcPr>
-          <w:p>
-            <w:r>
-              <w:t>A falta de integração que faz equipes recriarem o que outros já resolveram.</w:t>
-            </w:r>
-          </w:p>
-        </w:tc>
-        <w:tc>
-          <w:tcPr>
-            <w:tcW w:type="dxa" w:w="2160"/>
-          </w:tcPr>
-          <w:p>
-            <w:r>
-              <w:t>Conte quando você descobriu que outro órgão já havia desenvolvido uma solução similar à que você estava criando.</w:t>
-            </w:r>
-          </w:p>
-        </w:tc>
-      </w:tr>
-      <w:tr>
-        <w:tc>
-          <w:tcPr>
-            <w:tcW w:type="dxa" w:w="2160"/>
-          </w:tcPr>
-          <w:p>
-            <w:r>
-              <w:t>G06</w:t>
-            </w:r>
-          </w:p>
-        </w:tc>
-        <w:tc>
-          <w:tcPr>
-            <w:tcW w:type="dxa" w:w="2160"/>
-          </w:tcPr>
-          <w:p>
-            <w:r>
-              <w:t>Fio da meada</w:t>
-            </w:r>
-          </w:p>
-        </w:tc>
-        <w:tc>
-          <w:tcPr>
-            <w:tcW w:type="dxa" w:w="2160"/>
-          </w:tcPr>
-          <w:p>
-            <w:r>
-              <w:t>A gestão do conhecimento que documenta o processo e evita o recomeço do zero.</w:t>
-            </w:r>
-          </w:p>
-        </w:tc>
-        <w:tc>
-          <w:tcPr>
-            <w:tcW w:type="dxa" w:w="2160"/>
-          </w:tcPr>
-          <w:p>
-            <w:r>
-              <w:t>Conte quando a ausência de memória institucional fez o trabalho recomeçar do zero — ou quando uma boa documentação salvou tempo.</w:t>
-            </w:r>
-          </w:p>
-        </w:tc>
-      </w:tr>
-      <w:tr>
-        <w:tc>
-          <w:tcPr>
-            <w:tcW w:type="dxa" w:w="2160"/>
-          </w:tcPr>
-          <w:p>
-            <w:r>
-              <w:t>G07</w:t>
-            </w:r>
-          </w:p>
-        </w:tc>
-        <w:tc>
-          <w:tcPr>
-            <w:tcW w:type="dxa" w:w="2160"/>
-          </w:tcPr>
-          <w:p>
-            <w:r>
-              <w:t>Destrava</w:t>
-            </w:r>
-          </w:p>
-        </w:tc>
-        <w:tc>
-          <w:tcPr>
-            <w:tcW w:type="dxa" w:w="2160"/>
-          </w:tcPr>
-          <w:p>
-            <w:r>
-              <w:t>Identificar os gargalos e acionar os atores certos para destravar o fluxo.</w:t>
-            </w:r>
-          </w:p>
-        </w:tc>
-        <w:tc>
-          <w:tcPr>
-            <w:tcW w:type="dxa" w:w="2160"/>
-          </w:tcPr>
-          <w:p>
-            <w:r>
-              <w:t>Conte um trabalho seu que emperrou na burocracia. Quem ajudou a destravar ou o que faltou para a decisão avançar?</w:t>
-            </w:r>
-          </w:p>
-        </w:tc>
-      </w:tr>
-      <w:tr>
-        <w:tc>
-          <w:tcPr>
-            <w:tcW w:type="dxa" w:w="2160"/>
-          </w:tcPr>
-          <w:p>
-            <w:r>
-              <w:t>G08</w:t>
-            </w:r>
-          </w:p>
-        </w:tc>
-        <w:tc>
-          <w:tcPr>
-            <w:tcW w:type="dxa" w:w="2160"/>
-          </w:tcPr>
-          <w:p>
-            <w:r>
-              <w:t>Mãos dadas</w:t>
-            </w:r>
-          </w:p>
-        </w:tc>
-        <w:tc>
-          <w:tcPr>
-            <w:tcW w:type="dxa" w:w="2160"/>
-          </w:tcPr>
-          <w:p>
-            <w:r>
-              <w:t>O que extrapola sua competência direta se constrói por diálogo e pactuação.</w:t>
-            </w:r>
-          </w:p>
-        </w:tc>
-        <w:tc>
-          <w:tcPr>
-            <w:tcW w:type="dxa" w:w="2160"/>
-          </w:tcPr>
-          <w:p>
-            <w:r>
-              <w:t>Conte uma parceria entre órgãos ou equipes que prosperou por pactuação conjunta — ou uma que falhou por imposição de cima.</w:t>
-            </w:r>
-          </w:p>
-        </w:tc>
-      </w:tr>
-      <w:tr>
-        <w:tc>
-          <w:tcPr>
-            <w:tcW w:type="dxa" w:w="2160"/>
-          </w:tcPr>
-          <w:p>
-            <w:r>
-              <w:t>G09</w:t>
-            </w:r>
-          </w:p>
-        </w:tc>
-        <w:tc>
-          <w:tcPr>
-            <w:tcW w:type="dxa" w:w="2160"/>
-          </w:tcPr>
-          <w:p>
-            <w:r>
-              <w:t>O cidadão no centro da roda</w:t>
-            </w:r>
-          </w:p>
-        </w:tc>
-        <w:tc>
-          <w:tcPr>
-            <w:tcW w:type="dxa" w:w="2160"/>
-          </w:tcPr>
-          <w:p>
-            <w:r>
-              <w:t>Governança pública legítima orientada pelo impacto real na vida do cidadão.</w:t>
-            </w:r>
-          </w:p>
-        </w:tc>
-        <w:tc>
-          <w:tcPr>
-            <w:tcW w:type="dxa" w:w="2160"/>
-          </w:tcPr>
-          <w:p>
-            <w:r>
-              <w:t>Conte uma decisão que mudou positivamente quando alguém perguntou como isso afeta o cidadão? — ou quando faltou essa pergunta.</w:t>
-            </w:r>
-          </w:p>
-        </w:tc>
-      </w:tr>
-      <w:tr>
-        <w:tc>
-          <w:tcPr>
-            <w:tcW w:type="dxa" w:w="2160"/>
-          </w:tcPr>
-          <w:p>
-            <w:r>
-              <w:t>G10</w:t>
-            </w:r>
-          </w:p>
-        </w:tc>
-        <w:tc>
-          <w:tcPr>
-            <w:tcW w:type="dxa" w:w="2160"/>
-          </w:tcPr>
-          <w:p>
-            <w:r>
-              <w:t>Olho no lance</w:t>
-            </w:r>
-          </w:p>
-        </w:tc>
-        <w:tc>
-          <w:tcPr>
-            <w:tcW w:type="dxa" w:w="2160"/>
-          </w:tcPr>
-          <w:p>
-            <w:r>
-              <w:t>O acompanhamento estratégico que facilita entregas sem sufocar a autonomia.</w:t>
-            </w:r>
-          </w:p>
-        </w:tc>
-        <w:tc>
-          <w:tcPr>
-            <w:tcW w:type="dxa" w:w="2160"/>
-          </w:tcPr>
-          <w:p>
-            <w:r>
-              <w:t>Conte uma experiência de gestão que deu apoio e simplificou seu trabalho — ou uma que só gerou relatórios sem utilidade prática.</w:t>
+              <w:t>Conte uma vez em que registrar ou normatizar algo (ou deixar de registrar) mudou decisivamente o rumo da história.</w:t>
             </w:r>
           </w:p>
         </w:tc>
@@ -2492,6 +2300,493 @@
       </w:tr>
     </w:tbl>
     <w:p/>
+    <w:p>
+      <w:pPr>
+        <w:pStyle w:val="Heading2"/>
+      </w:pPr>
+      <w:r>
+        <w:rPr>
+          <w:color w:val="D14B2A"/>
+        </w:rPr>
+        <w:t>Ambiência</w:t>
+      </w:r>
+    </w:p>
+    <w:tbl>
+      <w:tblPr>
+        <w:tblStyle w:val="LightGrid-Accent1"/>
+        <w:tblW w:type="auto" w:w="0"/>
+        <w:tblLook w:firstColumn="1" w:firstRow="1" w:lastColumn="0" w:lastRow="0" w:noHBand="0" w:noVBand="1" w:val="04A0"/>
+      </w:tblPr>
+      <w:tblGrid>
+        <w:gridCol w:w="2160"/>
+        <w:gridCol w:w="2160"/>
+        <w:gridCol w:w="2160"/>
+        <w:gridCol w:w="2160"/>
+      </w:tblGrid>
+      <w:tr>
+        <w:tc>
+          <w:tcPr>
+            <w:tcW w:type="dxa" w:w="2160"/>
+          </w:tcPr>
+          <w:p>
+            <w:r>
+              <w:t>ID</w:t>
+            </w:r>
+          </w:p>
+        </w:tc>
+        <w:tc>
+          <w:tcPr>
+            <w:tcW w:type="dxa" w:w="2160"/>
+          </w:tcPr>
+          <w:p>
+            <w:r>
+              <w:t>Carta</w:t>
+            </w:r>
+          </w:p>
+        </w:tc>
+        <w:tc>
+          <w:tcPr>
+            <w:tcW w:type="dxa" w:w="2160"/>
+          </w:tcPr>
+          <w:p>
+            <w:r>
+              <w:t>Definição</w:t>
+            </w:r>
+          </w:p>
+        </w:tc>
+        <w:tc>
+          <w:tcPr>
+            <w:tcW w:type="dxa" w:w="2160"/>
+          </w:tcPr>
+          <w:p>
+            <w:r>
+              <w:t>Pergunta</w:t>
+            </w:r>
+          </w:p>
+        </w:tc>
+      </w:tr>
+      <w:tr>
+        <w:tc>
+          <w:tcPr>
+            <w:tcW w:type="dxa" w:w="2160"/>
+          </w:tcPr>
+          <w:p>
+            <w:r>
+              <w:t>A01</w:t>
+            </w:r>
+          </w:p>
+        </w:tc>
+        <w:tc>
+          <w:tcPr>
+            <w:tcW w:type="dxa" w:w="2160"/>
+          </w:tcPr>
+          <w:p>
+            <w:r>
+              <w:t>Pisar em ovos</w:t>
+            </w:r>
+          </w:p>
+        </w:tc>
+        <w:tc>
+          <w:tcPr>
+            <w:tcW w:type="dxa" w:w="2160"/>
+          </w:tcPr>
+          <w:p>
+            <w:r>
+              <w:t>O clima de desconfiança em que o medo do erro paralisa a iniciativa.</w:t>
+            </w:r>
+          </w:p>
+        </w:tc>
+        <w:tc>
+          <w:tcPr>
+            <w:tcW w:type="dxa" w:w="2160"/>
+          </w:tcPr>
+          <w:p>
+            <w:r>
+              <w:t>Conte um ambiente de trabalho onde você pisava em ovos. O que causava isso? E um onde você podia ser autêntico(a)?</w:t>
+            </w:r>
+          </w:p>
+        </w:tc>
+      </w:tr>
+      <w:tr>
+        <w:tc>
+          <w:tcPr>
+            <w:tcW w:type="dxa" w:w="2160"/>
+          </w:tcPr>
+          <w:p>
+            <w:r>
+              <w:t>A02</w:t>
+            </w:r>
+          </w:p>
+        </w:tc>
+        <w:tc>
+          <w:tcPr>
+            <w:tcW w:type="dxa" w:w="2160"/>
+          </w:tcPr>
+          <w:p>
+            <w:r>
+              <w:t>Elefante na sala</w:t>
+            </w:r>
+          </w:p>
+        </w:tc>
+        <w:tc>
+          <w:tcPr>
+            <w:tcW w:type="dxa" w:w="2160"/>
+          </w:tcPr>
+          <w:p>
+            <w:r>
+              <w:t>O problema evidente que todos enxergam mas ninguém tem coragem de nomear.</w:t>
+            </w:r>
+          </w:p>
+        </w:tc>
+        <w:tc>
+          <w:tcPr>
+            <w:tcW w:type="dxa" w:w="2160"/>
+          </w:tcPr>
+          <w:p>
+            <w:r>
+              <w:t>Conte uma vez em que alguém nomeou com coragem o elefante na sala. O que mudou depois? E quando ninguém falou qual foi o custo?</w:t>
+            </w:r>
+          </w:p>
+        </w:tc>
+      </w:tr>
+      <w:tr>
+        <w:tc>
+          <w:tcPr>
+            <w:tcW w:type="dxa" w:w="2160"/>
+          </w:tcPr>
+          <w:p>
+            <w:r>
+              <w:t>A03</w:t>
+            </w:r>
+          </w:p>
+        </w:tc>
+        <w:tc>
+          <w:tcPr>
+            <w:tcW w:type="dxa" w:w="2160"/>
+          </w:tcPr>
+          <w:p>
+            <w:r>
+              <w:t>Guardei pra mim</w:t>
+            </w:r>
+          </w:p>
+        </w:tc>
+        <w:tc>
+          <w:tcPr>
+            <w:tcW w:type="dxa" w:w="2160"/>
+          </w:tcPr>
+          <w:p>
+            <w:r>
+              <w:t>A ideia ou o alerta que ficou retido porque falar custava caro demais.</w:t>
+            </w:r>
+          </w:p>
+        </w:tc>
+        <w:tc>
+          <w:tcPr>
+            <w:tcW w:type="dxa" w:w="2160"/>
+          </w:tcPr>
+          <w:p>
+            <w:r>
+              <w:t>Conte uma ideia ou preocupação que você guardou para si por receio da reação. O que teria mudado se houvesse abertura?</w:t>
+            </w:r>
+          </w:p>
+        </w:tc>
+      </w:tr>
+      <w:tr>
+        <w:tc>
+          <w:tcPr>
+            <w:tcW w:type="dxa" w:w="2160"/>
+          </w:tcPr>
+          <w:p>
+            <w:r>
+              <w:t>A04</w:t>
+            </w:r>
+          </w:p>
+        </w:tc>
+        <w:tc>
+          <w:tcPr>
+            <w:tcW w:type="dxa" w:w="2160"/>
+          </w:tcPr>
+          <w:p>
+            <w:r>
+              <w:t>Portas abertas</w:t>
+            </w:r>
+          </w:p>
+        </w:tc>
+        <w:tc>
+          <w:tcPr>
+            <w:tcW w:type="dxa" w:w="2160"/>
+          </w:tcPr>
+          <w:p>
+            <w:r>
+              <w:t>A liderança acessível e empática que acolhe a inovação com apoio efetivo.</w:t>
+            </w:r>
+          </w:p>
+        </w:tc>
+        <w:tc>
+          <w:tcPr>
+            <w:tcW w:type="dxa" w:w="2160"/>
+          </w:tcPr>
+          <w:p>
+            <w:r>
+              <w:t>Conte como a presença de uma chefia de portas verdadeiramente abertas (ou fechadas) impactou a segurança da equipe.</w:t>
+            </w:r>
+          </w:p>
+        </w:tc>
+      </w:tr>
+      <w:tr>
+        <w:tc>
+          <w:tcPr>
+            <w:tcW w:type="dxa" w:w="2160"/>
+          </w:tcPr>
+          <w:p>
+            <w:r>
+              <w:t>A05</w:t>
+            </w:r>
+          </w:p>
+        </w:tc>
+        <w:tc>
+          <w:tcPr>
+            <w:tcW w:type="dxa" w:w="2160"/>
+          </w:tcPr>
+          <w:p>
+            <w:r>
+              <w:t>Não sei</w:t>
+            </w:r>
+          </w:p>
+        </w:tc>
+        <w:tc>
+          <w:tcPr>
+            <w:tcW w:type="dxa" w:w="2160"/>
+          </w:tcPr>
+          <w:p>
+            <w:r>
+              <w:t>A segurança psicológica de admitir limites como ponto de partida para aprender.</w:t>
+            </w:r>
+          </w:p>
+        </w:tc>
+        <w:tc>
+          <w:tcPr>
+            <w:tcW w:type="dxa" w:w="2160"/>
+          </w:tcPr>
+          <w:p>
+            <w:r>
+              <w:t>Conte quando um não sei ou me desculpe dito em público abriu espaço para cooperação — ou quando o orgulho custou caro.</w:t>
+            </w:r>
+          </w:p>
+        </w:tc>
+      </w:tr>
+      <w:tr>
+        <w:tc>
+          <w:tcPr>
+            <w:tcW w:type="dxa" w:w="2160"/>
+          </w:tcPr>
+          <w:p>
+            <w:r>
+              <w:t>A06</w:t>
+            </w:r>
+          </w:p>
+        </w:tc>
+        <w:tc>
+          <w:tcPr>
+            <w:tcW w:type="dxa" w:w="2160"/>
+          </w:tcPr>
+          <w:p>
+            <w:r>
+              <w:t>Dar um toque</w:t>
+            </w:r>
+          </w:p>
+        </w:tc>
+        <w:tc>
+          <w:tcPr>
+            <w:tcW w:type="dxa" w:w="2160"/>
+          </w:tcPr>
+          <w:p>
+            <w:r>
+              <w:t>O feedback construtivo e transparente que ajusta a rota com respeito e cuidado.</w:t>
+            </w:r>
+          </w:p>
+        </w:tc>
+        <w:tc>
+          <w:tcPr>
+            <w:tcW w:type="dxa" w:w="2160"/>
+          </w:tcPr>
+          <w:p>
+            <w:r>
+              <w:t>Conte um feedback sincero que você recebeu e aprimorou seu trabalho — ou aquele retorno que faltou e fez falta.</w:t>
+            </w:r>
+          </w:p>
+        </w:tc>
+      </w:tr>
+      <w:tr>
+        <w:tc>
+          <w:tcPr>
+            <w:tcW w:type="dxa" w:w="2160"/>
+          </w:tcPr>
+          <w:p>
+            <w:r>
+              <w:t>A07</w:t>
+            </w:r>
+          </w:p>
+        </w:tc>
+        <w:tc>
+          <w:tcPr>
+            <w:tcW w:type="dxa" w:w="2160"/>
+          </w:tcPr>
+          <w:p>
+            <w:r>
+              <w:t>Fazer o que fala</w:t>
+            </w:r>
+          </w:p>
+        </w:tc>
+        <w:tc>
+          <w:tcPr>
+            <w:tcW w:type="dxa" w:w="2160"/>
+          </w:tcPr>
+          <w:p>
+            <w:r>
+              <w:t>A coerência entre o discurso institucional e as atitudes práticas da gestão.</w:t>
+            </w:r>
+          </w:p>
+        </w:tc>
+        <w:tc>
+          <w:tcPr>
+            <w:tcW w:type="dxa" w:w="2160"/>
+          </w:tcPr>
+          <w:p>
+            <w:r>
+              <w:t>Conte uma atitude coerente da liderança que gerou forte confiança na equipe — ou uma quebra de discurso que desmobilizou o time.</w:t>
+            </w:r>
+          </w:p>
+        </w:tc>
+      </w:tr>
+      <w:tr>
+        <w:tc>
+          <w:tcPr>
+            <w:tcW w:type="dxa" w:w="2160"/>
+          </w:tcPr>
+          <w:p>
+            <w:r>
+              <w:t>A08</w:t>
+            </w:r>
+          </w:p>
+        </w:tc>
+        <w:tc>
+          <w:tcPr>
+            <w:tcW w:type="dxa" w:w="2160"/>
+          </w:tcPr>
+          <w:p>
+            <w:r>
+              <w:t>Prego que se destaca</w:t>
+            </w:r>
+          </w:p>
+        </w:tc>
+        <w:tc>
+          <w:tcPr>
+            <w:tcW w:type="dxa" w:w="2160"/>
+          </w:tcPr>
+          <w:p>
+            <w:r>
+              <w:t>Na cultura de inovação quem se destaca recebe apoio e abre caminhos.</w:t>
+            </w:r>
+          </w:p>
+        </w:tc>
+        <w:tc>
+          <w:tcPr>
+            <w:tcW w:type="dxa" w:w="2160"/>
+          </w:tcPr>
+          <w:p>
+            <w:r>
+              <w:t>Conte quando propor algo novo te rendeu apoio e oportunidades — ou quando gerou resistência e o que isso ensinou.</w:t>
+            </w:r>
+          </w:p>
+        </w:tc>
+      </w:tr>
+      <w:tr>
+        <w:tc>
+          <w:tcPr>
+            <w:tcW w:type="dxa" w:w="2160"/>
+          </w:tcPr>
+          <w:p>
+            <w:r>
+              <w:t>A09</w:t>
+            </w:r>
+          </w:p>
+        </w:tc>
+        <w:tc>
+          <w:tcPr>
+            <w:tcW w:type="dxa" w:w="2160"/>
+          </w:tcPr>
+          <w:p>
+            <w:r>
+              <w:t>Pertencimento</w:t>
+            </w:r>
+          </w:p>
+        </w:tc>
+        <w:tc>
+          <w:tcPr>
+            <w:tcW w:type="dxa" w:w="2160"/>
+          </w:tcPr>
+          <w:p>
+            <w:r>
+              <w:t>Sentir-se parte integrante e corresponsável por uma missão pública maior.</w:t>
+            </w:r>
+          </w:p>
+        </w:tc>
+        <w:tc>
+          <w:tcPr>
+            <w:tcW w:type="dxa" w:w="2160"/>
+          </w:tcPr>
+          <w:p>
+            <w:r>
+              <w:t>Conte quando você se sentiu verdadeiramente acolhido(a) e parte do propósito do órgão. O que gerou esse sentimento?</w:t>
+            </w:r>
+          </w:p>
+        </w:tc>
+      </w:tr>
+      <w:tr>
+        <w:tc>
+          <w:tcPr>
+            <w:tcW w:type="dxa" w:w="2160"/>
+          </w:tcPr>
+          <w:p>
+            <w:r>
+              <w:t>A10</w:t>
+            </w:r>
+          </w:p>
+        </w:tc>
+        <w:tc>
+          <w:tcPr>
+            <w:tcW w:type="dxa" w:w="2160"/>
+          </w:tcPr>
+          <w:p>
+            <w:r>
+              <w:t>Respiro</w:t>
+            </w:r>
+          </w:p>
+        </w:tc>
+        <w:tc>
+          <w:tcPr>
+            <w:tcW w:type="dxa" w:w="2160"/>
+          </w:tcPr>
+          <w:p>
+            <w:r>
+              <w:t>O tempo protegido na rotina para pensar se inspirar e inovar com clareza.</w:t>
+            </w:r>
+          </w:p>
+        </w:tc>
+        <w:tc>
+          <w:tcPr>
+            <w:tcW w:type="dxa" w:w="2160"/>
+          </w:tcPr>
+          <w:p>
+            <w:r>
+              <w:t>Conte quando uma pausa estratégica na rotina rendeu uma excelente solução — ou o que você criaria com um tempo livre semanal.</w:t>
+            </w:r>
+          </w:p>
+        </w:tc>
+      </w:tr>
+    </w:tbl>
+    <w:p/>
     <w:sectPr>
       <w:pgSz w:w="12240" w:h="15840"/>
       <w:pgMar w:top="1440" w:right="1800" w:bottom="1440" w:left="1800" w:header="720" w:footer="720" w:gutter="0"/>

</xml_diff>